<commit_message>
wip: chart setter fixes + examples regeneration
</commit_message>
<xml_diff>
--- a/examples/word/formulas.docx
+++ b/examples/word/formulas.docx
@@ -294,50 +294,50 @@
     <w:p>
       <m:oMathPara>
         <m:oMath>
-          <m:sSup>
-            <m:e>
-              <m:nary>
-                <m:naryPr>
-                  <m:chr m:val="∫"/>
-                </m:naryPr>
-                <m:sub>
-                  <m:r>
-                    <m:t xml:space="preserve">-</m:t>
-                  </m:r>
-                  <m:r>
-                    <m:t xml:space="preserve">∞</m:t>
-                  </m:r>
-                </m:sub>
-                <m:sup>
-                  <m:r>
-                    <m:t xml:space="preserve">+</m:t>
-                  </m:r>
-                  <m:r>
-                    <m:t xml:space="preserve">∞</m:t>
-                  </m:r>
-                </m:sup>
-                <m:e>
-                  <m:r>
-                    <m:t xml:space="preserve">e</m:t>
-                  </m:r>
-                </m:e>
-              </m:nary>
-            </m:e>
+          <m:nary>
+            <m:naryPr>
+              <m:chr m:val="∫"/>
+            </m:naryPr>
+            <m:sub>
+              <m:r>
+                <m:t xml:space="preserve">-</m:t>
+              </m:r>
+              <m:r>
+                <m:t xml:space="preserve">∞</m:t>
+              </m:r>
+            </m:sub>
             <m:sup>
+              <m:r>
+                <m:t xml:space="preserve">+</m:t>
+              </m:r>
+              <m:r>
+                <m:t xml:space="preserve">∞</m:t>
+              </m:r>
+            </m:sup>
+            <m:e>
               <m:sSup>
                 <m:e>
                   <m:r>
-                    <m:t xml:space="preserve">-x</m:t>
+                    <m:t xml:space="preserve">e</m:t>
                   </m:r>
                 </m:e>
                 <m:sup>
-                  <m:r>
-                    <m:t xml:space="preserve">2</m:t>
-                  </m:r>
+                  <m:sSup>
+                    <m:e>
+                      <m:r>
+                        <m:t xml:space="preserve">-x</m:t>
+                      </m:r>
+                    </m:e>
+                    <m:sup>
+                      <m:r>
+                        <m:t xml:space="preserve">2</m:t>
+                      </m:r>
+                    </m:sup>
+                  </m:sSup>
                 </m:sup>
               </m:sSup>
-            </m:sup>
-          </m:sSup>
+            </m:e>
+          </m:nary>
           <m:r>
             <m:t xml:space="preserve"> dx = </m:t>
           </m:r>
@@ -2479,7 +2479,7 @@
                       </m:sub>
                     </m:sSub>
                     <m:r>
-                      <m:t xml:space="preserve"> </m:t>
+                      <m:t xml:space="preserve"/>
                     </m:r>
                   </m:e>
                   <m:e>
@@ -2496,7 +2496,7 @@
                       </m:sub>
                     </m:sSub>
                     <m:r>
-                      <m:t xml:space="preserve"> </m:t>
+                      <m:t xml:space="preserve"/>
                     </m:r>
                   </m:e>
                   <m:e>
@@ -2513,7 +2513,7 @@
                       </m:sub>
                     </m:sSub>
                     <m:r>
-                      <m:t xml:space="preserve"> </m:t>
+                      <m:t xml:space="preserve"/>
                     </m:r>
                   </m:e>
                 </m:mr>
@@ -2532,7 +2532,7 @@
                       </m:sub>
                     </m:sSub>
                     <m:r>
-                      <m:t xml:space="preserve"> </m:t>
+                      <m:t xml:space="preserve"/>
                     </m:r>
                   </m:e>
                   <m:e>
@@ -2549,7 +2549,7 @@
                       </m:sub>
                     </m:sSub>
                     <m:r>
-                      <m:t xml:space="preserve"> </m:t>
+                      <m:t xml:space="preserve"/>
                     </m:r>
                   </m:e>
                   <m:e>
@@ -2566,7 +2566,7 @@
                       </m:sub>
                     </m:sSub>
                     <m:r>
-                      <m:t xml:space="preserve"> </m:t>
+                      <m:t xml:space="preserve"/>
                     </m:r>
                   </m:e>
                 </m:mr>
@@ -2585,7 +2585,7 @@
                       </m:sub>
                     </m:sSub>
                     <m:r>
-                      <m:t xml:space="preserve"> </m:t>
+                      <m:t xml:space="preserve"/>
                     </m:r>
                   </m:e>
                   <m:e>
@@ -2602,7 +2602,7 @@
                       </m:sub>
                     </m:sSub>
                     <m:r>
-                      <m:t xml:space="preserve"> </m:t>
+                      <m:t xml:space="preserve"/>
                     </m:r>
                   </m:e>
                   <m:e>
@@ -2619,7 +2619,7 @@
                       </m:sub>
                     </m:sSub>
                     <m:r>
-                      <m:t xml:space="preserve"> </m:t>
+                      <m:t xml:space="preserve"/>
                     </m:r>
                   </m:e>
                 </m:mr>
@@ -2659,24 +2659,24 @@
                 <m:mr>
                   <m:e>
                     <m:r>
-                      <m:t xml:space="preserve"> a </m:t>
+                      <m:t xml:space="preserve">a</m:t>
                     </m:r>
                   </m:e>
                   <m:e>
                     <m:r>
-                      <m:t xml:space="preserve"> b </m:t>
+                      <m:t xml:space="preserve">b</m:t>
                     </m:r>
                   </m:e>
                 </m:mr>
                 <m:mr>
                   <m:e>
                     <m:r>
-                      <m:t xml:space="preserve"> c </m:t>
+                      <m:t xml:space="preserve">c</m:t>
                     </m:r>
                   </m:e>
                   <m:e>
                     <m:r>
-                      <m:t xml:space="preserve"> d </m:t>
+                      <m:t xml:space="preserve">d</m:t>
                     </m:r>
                   </m:e>
                 </m:mr>
@@ -2725,51 +2725,51 @@
                 <m:mr>
                   <m:e>
                     <m:r>
-                      <m:t xml:space="preserve"> 1 </m:t>
+                      <m:t xml:space="preserve">1</m:t>
                     </m:r>
                   </m:e>
                   <m:e>
                     <m:r>
-                      <m:t xml:space="preserve"> 0 </m:t>
+                      <m:t xml:space="preserve">0</m:t>
                     </m:r>
                   </m:e>
                   <m:e>
                     <m:r>
-                      <m:t xml:space="preserve"> 0 </m:t>
+                      <m:t xml:space="preserve">0</m:t>
                     </m:r>
                   </m:e>
                 </m:mr>
                 <m:mr>
                   <m:e>
                     <m:r>
-                      <m:t xml:space="preserve"> 0 </m:t>
+                      <m:t xml:space="preserve">0</m:t>
                     </m:r>
                   </m:e>
                   <m:e>
                     <m:r>
-                      <m:t xml:space="preserve"> 1 </m:t>
+                      <m:t xml:space="preserve">1</m:t>
                     </m:r>
                   </m:e>
                   <m:e>
                     <m:r>
-                      <m:t xml:space="preserve"> 0 </m:t>
+                      <m:t xml:space="preserve">0</m:t>
                     </m:r>
                   </m:e>
                 </m:mr>
                 <m:mr>
                   <m:e>
                     <m:r>
-                      <m:t xml:space="preserve"> 0 </m:t>
+                      <m:t xml:space="preserve">0</m:t>
                     </m:r>
                   </m:e>
                   <m:e>
                     <m:r>
-                      <m:t xml:space="preserve"> 0 </m:t>
+                      <m:t xml:space="preserve">0</m:t>
                     </m:r>
                   </m:e>
                   <m:e>
                     <m:r>
-                      <m:t xml:space="preserve"> 1 </m:t>
+                      <m:t xml:space="preserve">1</m:t>
                     </m:r>
                   </m:e>
                 </m:mr>
@@ -2818,30 +2818,30 @@
                 <m:mr>
                   <m:e>
                     <m:r>
-                      <m:t xml:space="preserve"> x, </m:t>
+                      <m:t xml:space="preserve">x,</m:t>
                     </m:r>
                   </m:e>
                   <m:e>
                     <m:r>
-                      <m:t xml:space="preserve"> x </m:t>
+                      <m:t xml:space="preserve">x </m:t>
                     </m:r>
                     <m:r>
                       <m:t xml:space="preserve">≥</m:t>
                     </m:r>
                     <m:r>
-                      <m:t xml:space="preserve"> 0 </m:t>
+                      <m:t xml:space="preserve"> 0</m:t>
                     </m:r>
                   </m:e>
                 </m:mr>
                 <m:mr>
                   <m:e>
                     <m:r>
-                      <m:t xml:space="preserve"> -x, </m:t>
+                      <m:t xml:space="preserve">-x,</m:t>
                     </m:r>
                   </m:e>
                   <m:e>
                     <m:r>
-                      <m:t xml:space="preserve"> x &lt; 0 </m:t>
+                      <m:t xml:space="preserve">x &lt; 0</m:t>
                     </m:r>
                   </m:e>
                 </m:mr>
@@ -3468,29 +3468,29 @@
           <m:r>
             <m:t xml:space="preserve"> </m:t>
           </m:r>
-          <m:sSub>
-            <m:e>
-              <m:nary>
-                <m:naryPr>
-                  <m:chr m:val="∑"/>
-                  <m:subHide m:val="true"/>
-                  <m:supHide m:val="true"/>
-                </m:naryPr>
-                <m:sub/>
-                <m:sup/>
+          <m:nary>
+            <m:naryPr>
+              <m:chr m:val="∑"/>
+              <m:subHide m:val="true"/>
+              <m:supHide m:val="true"/>
+            </m:naryPr>
+            <m:sub/>
+            <m:sup/>
+            <m:e>
+              <m:sSub>
                 <m:e>
                   <m:r>
                     <m:t xml:space="preserve">x</m:t>
                   </m:r>
                 </m:e>
-              </m:nary>
-            </m:e>
-            <m:sub>
-              <m:r>
-                <m:t xml:space="preserve">i</m:t>
-              </m:r>
-            </m:sub>
-          </m:sSub>
+                <m:sub>
+                  <m:r>
+                    <m:t xml:space="preserve">i</m:t>
+                  </m:r>
+                </m:sub>
+              </m:sSub>
+            </m:e>
+          </m:nary>
           <m:r>
             <m:t xml:space="preserve">, </m:t>
           </m:r>
@@ -3980,114 +3980,114 @@
     <w:p>
       <m:oMathPara>
         <m:oMath>
-          <m:sSub>
-            <m:e>
-              <m:nary>
-                <m:naryPr>
-                  <m:chr m:val="⋃"/>
-                </m:naryPr>
+          <m:nary>
+            <m:naryPr>
+              <m:chr m:val="⋃"/>
+            </m:naryPr>
+            <m:sub>
+              <m:r>
+                <m:t xml:space="preserve">i=1</m:t>
+              </m:r>
+            </m:sub>
+            <m:sup>
+              <m:r>
+                <m:t xml:space="preserve">n</m:t>
+              </m:r>
+            </m:sup>
+            <m:e>
+              <m:sSub>
+                <m:e>
+                  <m:r>
+                    <m:t xml:space="preserve">A</m:t>
+                  </m:r>
+                </m:e>
                 <m:sub>
                   <m:r>
-                    <m:t xml:space="preserve">i=1</m:t>
+                    <m:t xml:space="preserve">i</m:t>
                   </m:r>
                 </m:sub>
-                <m:sup>
-                  <m:r>
-                    <m:t xml:space="preserve">n</m:t>
-                  </m:r>
-                </m:sup>
+              </m:sSub>
+            </m:e>
+          </m:nary>
+          <m:r>
+            <m:t xml:space="preserve"> </m:t>
+          </m:r>
+          <m:r>
+            <m:t xml:space="preserve">⊇</m:t>
+          </m:r>
+          <m:r>
+            <m:t xml:space="preserve"> </m:t>
+          </m:r>
+          <m:nary>
+            <m:naryPr>
+              <m:chr m:val="⋂"/>
+            </m:naryPr>
+            <m:sub>
+              <m:r>
+                <m:t xml:space="preserve">i=1</m:t>
+              </m:r>
+            </m:sub>
+            <m:sup>
+              <m:r>
+                <m:t xml:space="preserve">n</m:t>
+              </m:r>
+            </m:sup>
+            <m:e>
+              <m:sSub>
                 <m:e>
                   <m:r>
                     <m:t xml:space="preserve">A</m:t>
                   </m:r>
                 </m:e>
-              </m:nary>
-            </m:e>
+                <m:sub>
+                  <m:r>
+                    <m:t xml:space="preserve">i</m:t>
+                  </m:r>
+                </m:sub>
+              </m:sSub>
+            </m:e>
+          </m:nary>
+          <m:r>
+            <m:t xml:space="preserve">, </m:t>
+          </m:r>
+          <m:r>
+            <m:t xml:space="preserve"> </m:t>
+          </m:r>
+          <m:r>
+            <m:t xml:space="preserve"> </m:t>
+          </m:r>
+          <m:nary>
+            <m:naryPr>
+              <m:chr m:val="∐"/>
+              <m:supHide m:val="true"/>
+            </m:naryPr>
             <m:sub>
               <m:r>
-                <m:t xml:space="preserve">i</m:t>
+                <m:t xml:space="preserve">i </m:t>
+              </m:r>
+              <m:r>
+                <m:t xml:space="preserve">∈</m:t>
+              </m:r>
+              <m:r>
+                <m:t xml:space="preserve"> I</m:t>
               </m:r>
             </m:sub>
-          </m:sSub>
-          <m:r>
-            <m:t xml:space="preserve"> </m:t>
-          </m:r>
-          <m:r>
-            <m:t xml:space="preserve">⊇</m:t>
-          </m:r>
-          <m:r>
-            <m:t xml:space="preserve"> </m:t>
-          </m:r>
-          <m:sSub>
-            <m:e>
-              <m:nary>
-                <m:naryPr>
-                  <m:chr m:val="⋂"/>
-                </m:naryPr>
+            <m:sup/>
+            <m:e>
+              <m:sSub>
+                <m:e>
+                  <m:r>
+                    <m:t xml:space="preserve">X</m:t>
+                  </m:r>
+                </m:e>
                 <m:sub>
                   <m:r>
-                    <m:t xml:space="preserve">i=1</m:t>
+                    <m:t xml:space="preserve">i</m:t>
                   </m:r>
                 </m:sub>
-                <m:sup>
-                  <m:r>
-                    <m:t xml:space="preserve">n</m:t>
-                  </m:r>
-                </m:sup>
-                <m:e>
-                  <m:r>
-                    <m:t xml:space="preserve">A</m:t>
-                  </m:r>
-                </m:e>
-              </m:nary>
-            </m:e>
-            <m:sub>
-              <m:r>
-                <m:t xml:space="preserve">i</m:t>
-              </m:r>
-            </m:sub>
-          </m:sSub>
-          <m:r>
-            <m:t xml:space="preserve">, </m:t>
-          </m:r>
-          <m:r>
-            <m:t xml:space="preserve"> </m:t>
-          </m:r>
-          <m:r>
-            <m:t xml:space="preserve"> </m:t>
-          </m:r>
-          <m:sSub>
-            <m:e>
-              <m:nary>
-                <m:naryPr>
-                  <m:chr m:val="∐"/>
-                  <m:supHide m:val="true"/>
-                </m:naryPr>
-                <m:sub>
-                  <m:r>
-                    <m:t xml:space="preserve">i </m:t>
-                  </m:r>
-                  <m:r>
-                    <m:t xml:space="preserve">∈</m:t>
-                  </m:r>
-                  <m:r>
-                    <m:t xml:space="preserve"> I</m:t>
-                  </m:r>
-                </m:sub>
-                <m:sup/>
-                <m:e>
-                  <m:r>
-                    <m:t xml:space="preserve">X</m:t>
-                  </m:r>
-                </m:e>
-              </m:nary>
-            </m:e>
-            <m:sub>
-              <m:r>
-                <m:t xml:space="preserve">i</m:t>
-              </m:r>
-            </m:sub>
-          </m:sSub>
+              </m:sSub>
+            </m:e>
+          </m:nary>
         </m:oMath>
       </m:oMathPara>
     </w:p>
@@ -4236,18 +4236,18 @@
                       </m:sub>
                     </m:sSub>
                     <m:r>
-                      <m:t xml:space="preserve"> </m:t>
+                      <m:t xml:space="preserve"/>
                     </m:r>
                   </m:e>
                   <m:e>
                     <m:r>
-                      <m:t xml:space="preserve"> </m:t>
+                      <m:t xml:space="preserve"/>
                     </m:r>
                     <m:r>
                       <m:t xml:space="preserve">⋯</m:t>
                     </m:r>
                     <m:r>
-                      <m:t xml:space="preserve"> </m:t>
+                      <m:t xml:space="preserve"/>
                     </m:r>
                   </m:e>
                   <m:e>
@@ -4264,42 +4264,42 @@
                       </m:sub>
                     </m:sSub>
                     <m:r>
-                      <m:t xml:space="preserve"> </m:t>
+                      <m:t xml:space="preserve"/>
                     </m:r>
                   </m:e>
                 </m:mr>
                 <m:mr>
                   <m:e>
                     <m:r>
-                      <m:t xml:space="preserve"> </m:t>
+                      <m:t xml:space="preserve"/>
                     </m:r>
                     <m:r>
                       <m:t xml:space="preserve">⋮</m:t>
                     </m:r>
                     <m:r>
-                      <m:t xml:space="preserve"> </m:t>
+                      <m:t xml:space="preserve"/>
                     </m:r>
                   </m:e>
                   <m:e>
                     <m:r>
-                      <m:t xml:space="preserve"> </m:t>
+                      <m:t xml:space="preserve"/>
                     </m:r>
                     <m:r>
                       <m:t xml:space="preserve">⋱</m:t>
                     </m:r>
                     <m:r>
-                      <m:t xml:space="preserve"> </m:t>
+                      <m:t xml:space="preserve"/>
                     </m:r>
                   </m:e>
                   <m:e>
                     <m:r>
-                      <m:t xml:space="preserve"> </m:t>
+                      <m:t xml:space="preserve"/>
                     </m:r>
                     <m:r>
                       <m:t xml:space="preserve">⋮</m:t>
                     </m:r>
                     <m:r>
-                      <m:t xml:space="preserve"> </m:t>
+                      <m:t xml:space="preserve"/>
                     </m:r>
                   </m:e>
                 </m:mr>
@@ -4318,18 +4318,18 @@
                       </m:sub>
                     </m:sSub>
                     <m:r>
-                      <m:t xml:space="preserve"> </m:t>
+                      <m:t xml:space="preserve"/>
                     </m:r>
                   </m:e>
                   <m:e>
                     <m:r>
-                      <m:t xml:space="preserve"> </m:t>
+                      <m:t xml:space="preserve"/>
                     </m:r>
                     <m:r>
                       <m:t xml:space="preserve">⋯</m:t>
                     </m:r>
                     <m:r>
-                      <m:t xml:space="preserve"> </m:t>
+                      <m:t xml:space="preserve"/>
                     </m:r>
                   </m:e>
                   <m:e>
@@ -4346,7 +4346,7 @@
                       </m:sub>
                     </m:sSub>
                     <m:r>
-                      <m:t xml:space="preserve"> </m:t>
+                      <m:t xml:space="preserve"/>
                     </m:r>
                   </m:e>
                 </m:mr>
@@ -4689,40 +4689,40 @@
             </m:radPr>
             <m:deg/>
             <m:e>
-              <m:sSubSup>
+              <m:nary>
+                <m:naryPr>
+                  <m:chr m:val="∑"/>
+                </m:naryPr>
+                <m:sub>
+                  <m:r>
+                    <m:t xml:space="preserve">i=1</m:t>
+                  </m:r>
+                </m:sub>
+                <m:sup>
+                  <m:r>
+                    <m:t xml:space="preserve">n</m:t>
+                  </m:r>
+                </m:sup>
                 <m:e>
-                  <m:nary>
-                    <m:naryPr>
-                      <m:chr m:val="∑"/>
-                    </m:naryPr>
-                    <m:sub>
-                      <m:r>
-                        <m:t xml:space="preserve">i=1</m:t>
-                      </m:r>
-                    </m:sub>
-                    <m:sup>
-                      <m:r>
-                        <m:t xml:space="preserve">n</m:t>
-                      </m:r>
-                    </m:sup>
+                  <m:sSubSup>
                     <m:e>
                       <m:r>
                         <m:t xml:space="preserve">x</m:t>
                       </m:r>
                     </m:e>
-                  </m:nary>
+                    <m:sub>
+                      <m:r>
+                        <m:t xml:space="preserve">i</m:t>
+                      </m:r>
+                    </m:sub>
+                    <m:sup>
+                      <m:r>
+                        <m:t xml:space="preserve">2</m:t>
+                      </m:r>
+                    </m:sup>
+                  </m:sSubSup>
                 </m:e>
-                <m:sub>
-                  <m:r>
-                    <m:t xml:space="preserve">i</m:t>
-                  </m:r>
-                </m:sub>
-                <m:sup>
-                  <m:r>
-                    <m:t xml:space="preserve">2</m:t>
-                  </m:r>
-                </m:sup>
-              </m:sSubSup>
+              </m:nary>
             </m:e>
           </m:rad>
         </m:oMath>
@@ -4805,7 +4805,7 @@
 </file>
 
 <file path=word/styles.xml><?xml version="1.0" encoding="utf-8"?>
-<w:styles xmlns:w="http://schemas.openxmlformats.org/wordprocessingml/2006/main">
+<w:styles xmlns:w14="http://schemas.microsoft.com/office/word/2010/wordml" xmlns:mc="http://schemas.openxmlformats.org/markup-compatibility/2006" xmlns:w="http://schemas.openxmlformats.org/wordprocessingml/2006/main" mc:Ignorable="w14">
   <w:docDefaults>
     <w:rPrDefault>
       <w:rPr>

</xml_diff>